<commit_message>
Rework Word layouts: title+TOC page, INTRODUCTION, heading levels, page breaks
Technical Summary: drop subtitle; ticket=H2, questions=H3; page break per ticket.
Code Comparison: add INTRODUCTION page with ticket list; repo=H2, sub-sections=H3;
each repo on its own page. Both docs get a real automatic Table of Contents field.

Co-Authored-By: Claude Opus 4.8 <noreply@anthropic.com>
</commit_message>
<xml_diff>
--- a/templates/code_comparison_template.docx
+++ b/templates/code_comparison_template.docx
@@ -12,12 +12,93 @@
     </w:p>
     <w:p>
       <w:r>
+        <w:rPr>
+          <w:b/>
+          <w:sz w:val="28"/>
+        </w:rPr>
+        <w:t>Table of Contents</w:t>
+      </w:r>
+    </w:p>
+    <w:p>
+      <w:r>
+        <w:fldChar w:fldCharType="begin"/>
+        <w:instrText xml:space="preserve"> TOC \o "1-3" \h \z \u </w:instrText>
+        <w:fldChar w:fldCharType="separate"/>
+      </w:r>
+      <w:r>
+        <w:rPr>
+          <w:i/>
+        </w:rPr>
+        <w:t>Right-click here and choose “Update Field” to build the table of contents.</w:t>
+      </w:r>
+      <w:r>
+        <w:fldChar w:fldCharType="end"/>
+      </w:r>
+    </w:p>
+    <w:p>
+      <w:r>
+        <w:br w:type="page"/>
+      </w:r>
+    </w:p>
+    <w:p>
+      <w:pPr>
+        <w:pStyle w:val="Heading2"/>
+      </w:pPr>
+      <w:r>
+        <w:t>INTRODUCTION</w:t>
+      </w:r>
+    </w:p>
+    <w:p>
+      <w:r>
+        <w:t>This document will present the Code Comparison of the changes made in the following items:</w:t>
+      </w:r>
+    </w:p>
+    <w:p>
+      <w:r>
+        <w:t>{%p for t in tickets %}</w:t>
+      </w:r>
+    </w:p>
+    <w:p>
+      <w:pPr>
+        <w:pStyle w:val="ListBullet"/>
+      </w:pPr>
+      <w:r>
+        <w:t>{{ t.id }} - {{ t.title }}</w:t>
+      </w:r>
+    </w:p>
+    <w:p>
+      <w:r>
+        <w:t>{%p endfor %}</w:t>
+      </w:r>
+    </w:p>
+    <w:p>
+      <w:r>
+        <w:br w:type="page"/>
+      </w:r>
+    </w:p>
+    <w:p>
+      <w:r>
         <w:t>{%p for repo in repos %}</w:t>
       </w:r>
     </w:p>
     <w:p>
+      <w:r>
+        <w:t>{%p if not loop.first %}</w:t>
+      </w:r>
+    </w:p>
+    <w:p>
+      <w:r>
+        <w:br w:type="page"/>
+      </w:r>
+    </w:p>
+    <w:p>
+      <w:r>
+        <w:t>{%p endif %}</w:t>
+      </w:r>
+    </w:p>
+    <w:p>
       <w:pPr>
-        <w:pStyle w:val="Heading1"/>
+        <w:pStyle w:val="Heading2"/>
       </w:pPr>
       <w:r>
         <w:t>{{ repo.name }}</w:t>
@@ -49,7 +130,7 @@
     </w:p>
     <w:p>
       <w:pPr>
-        <w:pStyle w:val="Heading2"/>
+        <w:pStyle w:val="Heading3"/>
       </w:pPr>
       <w:r>
         <w:t>Files changed</w:t>
@@ -62,7 +143,7 @@
     </w:p>
     <w:p>
       <w:pPr>
-        <w:pStyle w:val="Heading2"/>
+        <w:pStyle w:val="Heading3"/>
       </w:pPr>
       <w:r>
         <w:t>Commits</w:t>
@@ -75,7 +156,7 @@
     </w:p>
     <w:p>
       <w:pPr>
-        <w:pStyle w:val="Heading2"/>
+        <w:pStyle w:val="Heading3"/>
       </w:pPr>
       <w:r>
         <w:t>Code changes</w:t>

</xml_diff>